<commit_message>
Prepare secure MIT public beta release
</commit_message>
<xml_diff>
--- a/docs/简历筛选工作台-Windows版使用手册.docx
+++ b/docs/简历筛选工作台-Windows版使用手册.docx
@@ -434,8 +434,8 @@
       <w:r>
         <w:drawing>
           <wp:inline xmlns:a="http://schemas.openxmlformats.org/drawingml/2006/main" xmlns:pic="http://schemas.openxmlformats.org/drawingml/2006/picture">
-            <wp:extent cx="5897880" cy="3237490"/>
-            <wp:docPr id="1" name="Picture 1" descr="设置 DeepSeek 凭据、模型与并行 Worker"/>
+            <wp:extent cx="5897880" cy="3235642"/>
+            <wp:docPr id="1" name="Picture 1" descr="设置 DeepSeek 凭据、分析模型与并行 Worker"/>
             <wp:cNvGraphicFramePr>
               <a:graphicFrameLocks noChangeAspect="1"/>
             </wp:cNvGraphicFramePr>
@@ -455,7 +455,7 @@
                   <pic:spPr>
                     <a:xfrm>
                       <a:off x="0" y="0"/>
-                      <a:ext cx="5897880" cy="3237490"/>
+                      <a:ext cx="5897880" cy="3235642"/>
                     </a:xfrm>
                     <a:prstGeom prst="rect"/>
                   </pic:spPr>
@@ -478,7 +478,7 @@
           <w:color w:val="667B80"/>
           <w:sz w:val="19"/>
         </w:rPr>
-        <w:t>图 1  设置 DeepSeek 凭据、模型与并行 Worker</w:t>
+        <w:t>图 1  设置 DeepSeek 凭据、分析模型与并行 Worker</w:t>
       </w:r>
     </w:p>
     <w:p>
@@ -505,23 +505,7 @@
           <w:color w:val="15353B"/>
           <w:sz w:val="22"/>
         </w:rPr>
-        <w:t>快速模型：用于条件解析和大多数候选人分析；填写账号实际可用的模型名称。</w:t>
-      </w:r>
-    </w:p>
-    <w:p>
-      <w:pPr>
-        <w:numPr>
-          <w:ilvl w:val="0"/>
-          <w:numId w:val="11"/>
-        </w:numPr>
-      </w:pPr>
-      <w:r>
-        <w:rPr>
-          <w:rFonts w:ascii="Microsoft YaHei" w:hAnsi="Microsoft YaHei" w:eastAsia="Microsoft YaHei"/>
-          <w:color w:val="15353B"/>
-          <w:sz w:val="22"/>
-        </w:rPr>
-        <w:t>复核模型：用于高价值或不确定结果的复核；可与快速模型相同。</w:t>
+        <w:t>分析模型：用于条件解析和候选人分析；填写账号实际可用的模型名称。</w:t>
       </w:r>
     </w:p>
     <w:p>
@@ -553,7 +537,7 @@
           <w:color w:val="15353B"/>
           <w:sz w:val="22"/>
         </w:rPr>
-        <w:t>隐私：建议启用发送前脱敏，减少电话、邮箱和身份证号进入模型请求。</w:t>
+        <w:t>隐私：建议启用发送前脱敏。每次云端任务都会再次确认；自动脱敏可能遗漏姓名、电话、邮箱、地址或身份证号，使用前应取得合法授权。</w:t>
       </w:r>
     </w:p>
     <w:p>

</xml_diff>

<commit_message>
Prepare secure MIT public beta release (#1)
* Prepare secure MIT public beta release

* Update GitHub Actions to Node 24 releases

* Fix portable release verification and licenses

* Make dependency license collection deterministic

* Locate Windows dependency metadata reliably

* Create standards-compliant portable archive
</commit_message>
<xml_diff>
--- a/docs/简历筛选工作台-Windows版使用手册.docx
+++ b/docs/简历筛选工作台-Windows版使用手册.docx
@@ -434,8 +434,8 @@
       <w:r>
         <w:drawing>
           <wp:inline xmlns:a="http://schemas.openxmlformats.org/drawingml/2006/main" xmlns:pic="http://schemas.openxmlformats.org/drawingml/2006/picture">
-            <wp:extent cx="5897880" cy="3237490"/>
-            <wp:docPr id="1" name="Picture 1" descr="设置 DeepSeek 凭据、模型与并行 Worker"/>
+            <wp:extent cx="5897880" cy="3235642"/>
+            <wp:docPr id="1" name="Picture 1" descr="设置 DeepSeek 凭据、分析模型与并行 Worker"/>
             <wp:cNvGraphicFramePr>
               <a:graphicFrameLocks noChangeAspect="1"/>
             </wp:cNvGraphicFramePr>
@@ -455,7 +455,7 @@
                   <pic:spPr>
                     <a:xfrm>
                       <a:off x="0" y="0"/>
-                      <a:ext cx="5897880" cy="3237490"/>
+                      <a:ext cx="5897880" cy="3235642"/>
                     </a:xfrm>
                     <a:prstGeom prst="rect"/>
                   </pic:spPr>
@@ -478,7 +478,7 @@
           <w:color w:val="667B80"/>
           <w:sz w:val="19"/>
         </w:rPr>
-        <w:t>图 1  设置 DeepSeek 凭据、模型与并行 Worker</w:t>
+        <w:t>图 1  设置 DeepSeek 凭据、分析模型与并行 Worker</w:t>
       </w:r>
     </w:p>
     <w:p>
@@ -505,23 +505,7 @@
           <w:color w:val="15353B"/>
           <w:sz w:val="22"/>
         </w:rPr>
-        <w:t>快速模型：用于条件解析和大多数候选人分析；填写账号实际可用的模型名称。</w:t>
-      </w:r>
-    </w:p>
-    <w:p>
-      <w:pPr>
-        <w:numPr>
-          <w:ilvl w:val="0"/>
-          <w:numId w:val="11"/>
-        </w:numPr>
-      </w:pPr>
-      <w:r>
-        <w:rPr>
-          <w:rFonts w:ascii="Microsoft YaHei" w:hAnsi="Microsoft YaHei" w:eastAsia="Microsoft YaHei"/>
-          <w:color w:val="15353B"/>
-          <w:sz w:val="22"/>
-        </w:rPr>
-        <w:t>复核模型：用于高价值或不确定结果的复核；可与快速模型相同。</w:t>
+        <w:t>分析模型：用于条件解析和候选人分析；填写账号实际可用的模型名称。</w:t>
       </w:r>
     </w:p>
     <w:p>
@@ -553,7 +537,7 @@
           <w:color w:val="15353B"/>
           <w:sz w:val="22"/>
         </w:rPr>
-        <w:t>隐私：建议启用发送前脱敏，减少电话、邮箱和身份证号进入模型请求。</w:t>
+        <w:t>隐私：建议启用发送前脱敏。每次云端任务都会再次确认；自动脱敏可能遗漏姓名、电话、邮箱、地址或身份证号，使用前应取得合法授权。</w:t>
       </w:r>
     </w:p>
     <w:p>

</xml_diff>